<commit_message>
Vorzimmer-Skript: Eröffnung souverän knappen, Filterfrage in zwei Stufen
- Eröffnung drastisch gekürzt: nur Geschäftsführer-Identität + Bitte um Verbindung. Selbstauskunft (Diplom-Kaufmann etc.) und Branchenreport-Pitch eskaliert ans Vorzimmer-Filter-Stage statt in die Tür.
- Section 3 in zwei Stufen: erste Kompakt-Antwort auf „Worum geht es?", längere Substanz-Antwort nur wenn weiter nachgehakt wird.
- Decision-Tree-Label angepasst.

Co-Authored-By: Claude Opus 4.7 (1M context) <noreply@anthropic.com>
</commit_message>
<xml_diff>
--- a/outbound/docs/Flowbeaver_Vorzimmer_Anrufskript.docx
+++ b/outbound/docs/Flowbeaver_Vorzimmer_Anrufskript.docx
@@ -64,18 +64,6 @@
     </w:p>
     <w:p>
       <w:pPr>
-        <w:spacing w:before="200" w:after="60"/>
-      </w:pPr>
-      <w:r>
-        <w:rPr>
-          <w:b/>
-          <w:sz w:val="22"/>
-        </w:rPr>
-        <w:t>Standardvariante</w:t>
-      </w:r>
-    </w:p>
-    <w:p>
-      <w:pPr>
         <w:spacing w:before="80" w:after="160"/>
         <w:ind w:left="227"/>
         <w:pBdr>
@@ -88,36 +76,18 @@
           <w:color w:val="333333"/>
           <w:sz w:val="23"/>
         </w:rPr>
-        <w:t>Mein Name ist Andreas Schwarzkopf, Diplom-Kaufmann und Unternehmer. Ich habe gerade einen Branchenreport zur Lage in Steuerkanzleien zusammengestellt — und suche dafür den Austausch mit Inhabern wachsender Kanzleien. Unternehmer zu Unternehmer. Konkret: wie wachsen Sie weiter, wenn der Stellenmarkt nichts mehr hergibt? Ist Frau/Herr [Name] kurz erreichbar?</w:t>
+        <w:t>Guten Tag, Andreas Schwarzkopf, Geschäftsführer der Flowbeaver GmbH. Ich würde Frau/Herrn [Name] gerne erreichen.</w:t>
       </w:r>
     </w:p>
     <w:p>
       <w:pPr>
-        <w:spacing w:before="200" w:after="60"/>
+        <w:spacing w:after="120"/>
       </w:pPr>
       <w:r>
         <w:rPr>
-          <w:b/>
           <w:sz w:val="22"/>
         </w:rPr>
-        <w:t>Kürzere Variante</w:t>
-      </w:r>
-    </w:p>
-    <w:p>
-      <w:pPr>
-        <w:spacing w:before="80" w:after="160"/>
-        <w:ind w:left="227"/>
-        <w:pBdr>
-          <w:left w:val="single" w:sz="18" w:space="8" w:color="52267A"/>
-        </w:pBdr>
-      </w:pPr>
-      <w:r>
-        <w:rPr>
-          <w:i/>
-          <w:color w:val="333333"/>
-          <w:sz w:val="23"/>
-        </w:rPr>
-        <w:t>Andreas Schwarzkopf, Diplom-Kaufmann und Unternehmer. Ich habe gerade einen Branchenreport zur Lage in Steuerkanzleien fertig und suche dafür die Praxis-Sicht von Inhabern wachsender Kanzleien. Ist Frau/Herr [Name] kurz erreichbar?</w:t>
+        <w:t>Souverän, knapp, B2B-Standard. Der Geschäftsführer-Titel ist die Authority, die das Vorzimmer in Sekunden klassifizieren lässt: kein Vertrieb, kein Cold-Caller, sondern Peer-Anfrage. Alles weitere kommt nur auf Rückfrage — keine Selbstauskunft, kein Vortrag, kein Vorgeplänkel zur eigenen Person.</w:t>
       </w:r>
     </w:p>
     <w:p>
@@ -130,7 +100,7 @@
           <w:color w:val="555555"/>
           <w:sz w:val="21"/>
         </w:rPr>
-        <w:t>→  Drei mögliche Reaktionen vom Vorzimmer: durchstellen (Punkt 2) — Filterfrage „Was bringen Sie mit?“ (Punkt 3) — Boss-Check mit Rückfrage (Punkt 4).</w:t>
+        <w:t>→  Drei mögliche Reaktionen vom Vorzimmer: direkt durchstellen (Punkt 2) — Filterfrage „Worum geht es?“ vor Boss-Check (Punkt 3) — Boss-Check mit Rückfrage zurück (Punkt 4).</w:t>
       </w:r>
     </w:p>
     <w:p>
@@ -167,7 +137,7 @@
           <w:color w:val="52267A"/>
           <w:sz w:val="28"/>
         </w:rPr>
-        <w:t>3.  Vorzimmer-Filter VOR Boss-Check: „Was bringen Sie denn konkret mit?“</w:t>
+        <w:t>3.  Vorzimmer-Filter VOR Boss-Check: „Worum geht es?“</w:t>
       </w:r>
     </w:p>
     <w:p>
@@ -178,7 +148,36 @@
         <w:rPr>
           <w:sz w:val="22"/>
         </w:rPr>
-        <w:t>Die Empfangsdame filtert für den Chef, hat ihn aber noch nicht gefragt.</w:t>
+        <w:t>Die Empfangsdame filtert für den Chef, hat ihn aber noch nicht gefragt. Erste Antwort kompakt halten.</w:t>
+      </w:r>
+    </w:p>
+    <w:p>
+      <w:pPr>
+        <w:spacing w:before="80" w:after="160"/>
+        <w:ind w:left="227"/>
+        <w:pBdr>
+          <w:left w:val="single" w:sz="18" w:space="8" w:color="52267A"/>
+        </w:pBdr>
+      </w:pPr>
+      <w:r>
+        <w:rPr>
+          <w:i/>
+          <w:color w:val="333333"/>
+          <w:sz w:val="23"/>
+        </w:rPr>
+        <w:t>Geschäftliche Anfrage. Ich habe gerade einen Branchenreport zur Lage in Steuerkanzleien fertig und suche dafür die Praxis-Sicht von Inhabern wachsender Kanzleien. Den Report bekommt Frau/Herr [Name] gerne zugeschickt — wertvoller wäre mir ein kurzer Austausch dazu.</w:t>
+      </w:r>
+    </w:p>
+    <w:p>
+      <w:pPr>
+        <w:spacing w:before="200" w:after="60"/>
+      </w:pPr>
+      <w:r>
+        <w:rPr>
+          <w:b/>
+          <w:sz w:val="22"/>
+        </w:rPr>
+        <w:t>Wenn sie weiter nachhakt: „Was bringen Sie denn konkret mit?“</w:t>
       </w:r>
     </w:p>
     <w:p>
@@ -562,7 +561,7 @@
           <w:rFonts w:ascii="Courier New" w:hAnsi="Courier New"/>
           <w:sz w:val="20"/>
         </w:rPr>
-        <w:t xml:space="preserve">   |— „Was bringen Sie mit?“ → Punkt 3 → ggf. Punkt 4 oder Durchstellen</w:t>
+        <w:t xml:space="preserve">   |— „Worum geht es?“ → Punkt 3 → ggf. Punkt 4 oder Durchstellen</w:t>
       </w:r>
     </w:p>
     <w:p>

</xml_diff>